<commit_message>
changement complet du mode de génération des monstres et des items pour passer sur un système fixe, pareil pour les items des rooms et des monstres ajout de l'algo en fonction de l'index
</commit_message>
<xml_diff>
--- a/docs/~WRA3183.docx
+++ b/docs/~WRA3183.docx
@@ -620,41 +620,13 @@
                 <w:lang w:val="en-US"/>
               </w:rPr>
             </w:pPr>
-            <w:proofErr w:type="spellStart"/>
             <w:r>
               <w:rPr>
                 <w:sz w:val="24"/>
                 <w:szCs w:val="24"/>
                 <w:lang w:val="en-US"/>
               </w:rPr>
-              <w:t>greetHero</w:t>
-            </w:r>
-            <w:proofErr w:type="spellEnd"/>
-            <w:r>
-              <w:rPr>
-                <w:sz w:val="24"/>
-                <w:szCs w:val="24"/>
-                <w:lang w:val="en-US"/>
-              </w:rPr>
-              <w:t>(</w:t>
-            </w:r>
-            <w:proofErr w:type="spellStart"/>
-            <w:r>
-              <w:rPr>
-                <w:sz w:val="24"/>
-                <w:szCs w:val="24"/>
-                <w:lang w:val="en-US"/>
-              </w:rPr>
-              <w:t>p_Hero</w:t>
-            </w:r>
-            <w:proofErr w:type="spellEnd"/>
-            <w:r>
-              <w:rPr>
-                <w:sz w:val="24"/>
-                <w:szCs w:val="24"/>
-                <w:lang w:val="en-US"/>
-              </w:rPr>
-              <w:t xml:space="preserve">: Hero): void  </w:t>
+              <w:t xml:space="preserve">greetHero(p_Hero: Hero): void  </w:t>
             </w:r>
           </w:p>
         </w:tc>
@@ -686,23 +658,13 @@
                 <w:lang w:val="en-US"/>
               </w:rPr>
             </w:pPr>
-            <w:proofErr w:type="spellStart"/>
             <w:r>
               <w:rPr>
                 <w:sz w:val="24"/>
                 <w:szCs w:val="24"/>
                 <w:lang w:val="en-US"/>
               </w:rPr>
-              <w:t>getMonster</w:t>
-            </w:r>
-            <w:proofErr w:type="spellEnd"/>
-            <w:r>
-              <w:rPr>
-                <w:sz w:val="24"/>
-                <w:szCs w:val="24"/>
-                <w:lang w:val="en-US"/>
-              </w:rPr>
-              <w:t xml:space="preserve">(): Monster  </w:t>
+              <w:t xml:space="preserve">getMonster(): Monster  </w:t>
             </w:r>
           </w:p>
         </w:tc>
@@ -772,23 +734,13 @@
                 <w:lang w:val="en-US"/>
               </w:rPr>
             </w:pPr>
-            <w:proofErr w:type="spellStart"/>
             <w:r>
               <w:rPr>
                 <w:sz w:val="24"/>
                 <w:szCs w:val="24"/>
                 <w:lang w:val="en-US"/>
               </w:rPr>
-              <w:t>getEffectiveWeaponType</w:t>
-            </w:r>
-            <w:proofErr w:type="spellEnd"/>
-            <w:r>
-              <w:rPr>
-                <w:sz w:val="24"/>
-                <w:szCs w:val="24"/>
-                <w:lang w:val="en-US"/>
-              </w:rPr>
-              <w:t xml:space="preserve">(): String  </w:t>
+              <w:t xml:space="preserve">getEffectiveWeaponType(): String  </w:t>
             </w:r>
           </w:p>
         </w:tc>
@@ -858,59 +810,13 @@
                 <w:lang w:val="en-US"/>
               </w:rPr>
             </w:pPr>
-            <w:proofErr w:type="spellStart"/>
             <w:r>
               <w:rPr>
                 <w:sz w:val="24"/>
                 <w:szCs w:val="24"/>
                 <w:lang w:val="en-US"/>
               </w:rPr>
-              <w:t>isWeaponEfficient</w:t>
-            </w:r>
-            <w:proofErr w:type="spellEnd"/>
-            <w:r>
-              <w:rPr>
-                <w:sz w:val="24"/>
-                <w:szCs w:val="24"/>
-                <w:lang w:val="en-US"/>
-              </w:rPr>
-              <w:t>(</w:t>
-            </w:r>
-            <w:proofErr w:type="spellStart"/>
-            <w:r>
-              <w:rPr>
-                <w:sz w:val="24"/>
-                <w:szCs w:val="24"/>
-                <w:lang w:val="en-US"/>
-              </w:rPr>
-              <w:t>p_Weapon</w:t>
-            </w:r>
-            <w:proofErr w:type="spellEnd"/>
-            <w:r>
-              <w:rPr>
-                <w:sz w:val="24"/>
-                <w:szCs w:val="24"/>
-                <w:lang w:val="en-US"/>
-              </w:rPr>
-              <w:t xml:space="preserve">: Weapon): </w:t>
-            </w:r>
-            <w:proofErr w:type="spellStart"/>
-            <w:r>
-              <w:rPr>
-                <w:sz w:val="24"/>
-                <w:szCs w:val="24"/>
-                <w:lang w:val="en-US"/>
-              </w:rPr>
-              <w:t>boolean</w:t>
-            </w:r>
-            <w:proofErr w:type="spellEnd"/>
-            <w:r>
-              <w:rPr>
-                <w:sz w:val="24"/>
-                <w:szCs w:val="24"/>
-                <w:lang w:val="en-US"/>
-              </w:rPr>
-              <w:t xml:space="preserve">  </w:t>
+              <w:t xml:space="preserve">isWeaponEfficient(p_Weapon: Weapon): boolean  </w:t>
             </w:r>
           </w:p>
         </w:tc>
@@ -942,41 +848,13 @@
                 <w:lang w:val="en-US"/>
               </w:rPr>
             </w:pPr>
-            <w:proofErr w:type="spellStart"/>
             <w:r>
               <w:rPr>
                 <w:sz w:val="24"/>
                 <w:szCs w:val="24"/>
                 <w:lang w:val="en-US"/>
               </w:rPr>
-              <w:t>applyEffect</w:t>
-            </w:r>
-            <w:proofErr w:type="spellEnd"/>
-            <w:r>
-              <w:rPr>
-                <w:sz w:val="24"/>
-                <w:szCs w:val="24"/>
-                <w:lang w:val="en-US"/>
-              </w:rPr>
-              <w:t>(</w:t>
-            </w:r>
-            <w:proofErr w:type="spellStart"/>
-            <w:r>
-              <w:rPr>
-                <w:sz w:val="24"/>
-                <w:szCs w:val="24"/>
-                <w:lang w:val="en-US"/>
-              </w:rPr>
-              <w:t>p_Hero</w:t>
-            </w:r>
-            <w:proofErr w:type="spellEnd"/>
-            <w:r>
-              <w:rPr>
-                <w:sz w:val="24"/>
-                <w:szCs w:val="24"/>
-                <w:lang w:val="en-US"/>
-              </w:rPr>
-              <w:t xml:space="preserve">: Hero): void  </w:t>
+              <w:t xml:space="preserve">applyEffect(p_Hero: Hero): void  </w:t>
             </w:r>
           </w:p>
         </w:tc>
@@ -1008,41 +886,13 @@
                 <w:lang w:val="en-US"/>
               </w:rPr>
             </w:pPr>
-            <w:proofErr w:type="spellStart"/>
             <w:r>
               <w:rPr>
                 <w:sz w:val="24"/>
                 <w:szCs w:val="24"/>
                 <w:lang w:val="en-US"/>
               </w:rPr>
-              <w:t>setValue</w:t>
-            </w:r>
-            <w:proofErr w:type="spellEnd"/>
-            <w:r>
-              <w:rPr>
-                <w:sz w:val="24"/>
-                <w:szCs w:val="24"/>
-                <w:lang w:val="en-US"/>
-              </w:rPr>
-              <w:t>(</w:t>
-            </w:r>
-            <w:proofErr w:type="spellStart"/>
-            <w:r>
-              <w:rPr>
-                <w:sz w:val="24"/>
-                <w:szCs w:val="24"/>
-                <w:lang w:val="en-US"/>
-              </w:rPr>
-              <w:t>p_Value</w:t>
-            </w:r>
-            <w:proofErr w:type="spellEnd"/>
-            <w:r>
-              <w:rPr>
-                <w:sz w:val="24"/>
-                <w:szCs w:val="24"/>
-                <w:lang w:val="en-US"/>
-              </w:rPr>
-              <w:t xml:space="preserve">: int): void  </w:t>
+              <w:t xml:space="preserve">setValue(p_Value: int): void  </w:t>
             </w:r>
           </w:p>
         </w:tc>
@@ -1074,41 +924,13 @@
                 <w:lang w:val="en-US"/>
               </w:rPr>
             </w:pPr>
-            <w:proofErr w:type="spellStart"/>
             <w:r>
               <w:rPr>
                 <w:sz w:val="24"/>
                 <w:szCs w:val="24"/>
                 <w:lang w:val="en-US"/>
               </w:rPr>
-              <w:t>applyEffect</w:t>
-            </w:r>
-            <w:proofErr w:type="spellEnd"/>
-            <w:r>
-              <w:rPr>
-                <w:sz w:val="24"/>
-                <w:szCs w:val="24"/>
-                <w:lang w:val="en-US"/>
-              </w:rPr>
-              <w:t>(</w:t>
-            </w:r>
-            <w:proofErr w:type="spellStart"/>
-            <w:r>
-              <w:rPr>
-                <w:sz w:val="24"/>
-                <w:szCs w:val="24"/>
-                <w:lang w:val="en-US"/>
-              </w:rPr>
-              <w:t>p_Hero</w:t>
-            </w:r>
-            <w:proofErr w:type="spellEnd"/>
-            <w:r>
-              <w:rPr>
-                <w:sz w:val="24"/>
-                <w:szCs w:val="24"/>
-                <w:lang w:val="en-US"/>
-              </w:rPr>
-              <w:t>: Hero): void</w:t>
+              <w:t>applyEffect(p_Hero: Hero): void</w:t>
             </w:r>
           </w:p>
         </w:tc>
@@ -1140,41 +962,13 @@
                 <w:lang w:val="en-US"/>
               </w:rPr>
             </w:pPr>
-            <w:proofErr w:type="spellStart"/>
             <w:r>
               <w:rPr>
                 <w:sz w:val="24"/>
                 <w:szCs w:val="24"/>
                 <w:lang w:val="en-US"/>
               </w:rPr>
-              <w:t>applyEffect</w:t>
-            </w:r>
-            <w:proofErr w:type="spellEnd"/>
-            <w:r>
-              <w:rPr>
-                <w:sz w:val="24"/>
-                <w:szCs w:val="24"/>
-                <w:lang w:val="en-US"/>
-              </w:rPr>
-              <w:t>(</w:t>
-            </w:r>
-            <w:proofErr w:type="spellStart"/>
-            <w:r>
-              <w:rPr>
-                <w:sz w:val="24"/>
-                <w:szCs w:val="24"/>
-                <w:lang w:val="en-US"/>
-              </w:rPr>
-              <w:t>p_Hero</w:t>
-            </w:r>
-            <w:proofErr w:type="spellEnd"/>
-            <w:r>
-              <w:rPr>
-                <w:sz w:val="24"/>
-                <w:szCs w:val="24"/>
-                <w:lang w:val="en-US"/>
-              </w:rPr>
-              <w:t>: Hero): void</w:t>
+              <w:t>applyEffect(p_Hero: Hero): void</w:t>
             </w:r>
           </w:p>
         </w:tc>
@@ -1212,25 +1006,7 @@
                 <w:szCs w:val="24"/>
                 <w:lang w:val="en-US"/>
               </w:rPr>
-              <w:t>attack(</w:t>
-            </w:r>
-            <w:proofErr w:type="spellStart"/>
-            <w:r>
-              <w:rPr>
-                <w:sz w:val="24"/>
-                <w:szCs w:val="24"/>
-                <w:lang w:val="en-US"/>
-              </w:rPr>
-              <w:t>p_TargetCharacter</w:t>
-            </w:r>
-            <w:proofErr w:type="spellEnd"/>
-            <w:r>
-              <w:rPr>
-                <w:sz w:val="24"/>
-                <w:szCs w:val="24"/>
-                <w:lang w:val="en-US"/>
-              </w:rPr>
-              <w:t xml:space="preserve">: Character): void  </w:t>
+              <w:t xml:space="preserve">attack(p_TargetCharacter: Character): void  </w:t>
             </w:r>
           </w:p>
         </w:tc>
@@ -1262,23 +1038,13 @@
                 <w:lang w:val="en-US"/>
               </w:rPr>
             </w:pPr>
-            <w:proofErr w:type="spellStart"/>
             <w:r>
               <w:rPr>
                 <w:sz w:val="24"/>
                 <w:szCs w:val="24"/>
                 <w:lang w:val="en-US"/>
               </w:rPr>
-              <w:t>getLifePoints</w:t>
-            </w:r>
-            <w:proofErr w:type="spellEnd"/>
-            <w:r>
-              <w:rPr>
-                <w:sz w:val="24"/>
-                <w:szCs w:val="24"/>
-                <w:lang w:val="en-US"/>
-              </w:rPr>
-              <w:t xml:space="preserve">(): int  </w:t>
+              <w:t xml:space="preserve">getLifePoints(): int  </w:t>
             </w:r>
           </w:p>
         </w:tc>
@@ -1348,34 +1114,14 @@
                 <w:lang w:val="en-US"/>
               </w:rPr>
             </w:pPr>
-            <w:proofErr w:type="spellStart"/>
             <w:r>
               <w:rPr>
                 <w:sz w:val="24"/>
                 <w:szCs w:val="24"/>
                 <w:lang w:val="en-US"/>
               </w:rPr>
-              <w:t>isAlive</w:t>
+              <w:t>isAlive(): boolean</w:t>
             </w:r>
-            <w:proofErr w:type="spellEnd"/>
-            <w:r>
-              <w:rPr>
-                <w:sz w:val="24"/>
-                <w:szCs w:val="24"/>
-                <w:lang w:val="en-US"/>
-              </w:rPr>
-              <w:t xml:space="preserve">(): </w:t>
-            </w:r>
-            <w:proofErr w:type="spellStart"/>
-            <w:r>
-              <w:rPr>
-                <w:sz w:val="24"/>
-                <w:szCs w:val="24"/>
-                <w:lang w:val="en-US"/>
-              </w:rPr>
-              <w:t>boolean</w:t>
-            </w:r>
-            <w:proofErr w:type="spellEnd"/>
           </w:p>
         </w:tc>
         <w:tc>
@@ -1450,25 +1196,7 @@
                 <w:szCs w:val="24"/>
                 <w:lang w:val="en-US"/>
               </w:rPr>
-              <w:t>attack(</w:t>
-            </w:r>
-            <w:proofErr w:type="spellStart"/>
-            <w:r>
-              <w:rPr>
-                <w:sz w:val="24"/>
-                <w:szCs w:val="24"/>
-                <w:lang w:val="en-US"/>
-              </w:rPr>
-              <w:t>p_TargetCharacter</w:t>
-            </w:r>
-            <w:proofErr w:type="spellEnd"/>
-            <w:r>
-              <w:rPr>
-                <w:sz w:val="24"/>
-                <w:szCs w:val="24"/>
-                <w:lang w:val="en-US"/>
-              </w:rPr>
-              <w:t xml:space="preserve">: Character): void  </w:t>
+              <w:t xml:space="preserve">attack(p_TargetCharacter: Character): void  </w:t>
             </w:r>
           </w:p>
         </w:tc>
@@ -1506,25 +1234,7 @@
                 <w:szCs w:val="24"/>
                 <w:lang w:val="en-US"/>
               </w:rPr>
-              <w:t>attack(</w:t>
-            </w:r>
-            <w:proofErr w:type="spellStart"/>
-            <w:r>
-              <w:rPr>
-                <w:sz w:val="24"/>
-                <w:szCs w:val="24"/>
-                <w:lang w:val="en-US"/>
-              </w:rPr>
-              <w:t>p_TargetEnemy</w:t>
-            </w:r>
-            <w:proofErr w:type="spellEnd"/>
-            <w:r>
-              <w:rPr>
-                <w:sz w:val="24"/>
-                <w:szCs w:val="24"/>
-                <w:lang w:val="en-US"/>
-              </w:rPr>
-              <w:t xml:space="preserve">: Monster): void  </w:t>
+              <w:t xml:space="preserve">attack(p_TargetEnemy: Monster): void  </w:t>
             </w:r>
           </w:p>
         </w:tc>
@@ -1556,41 +1266,13 @@
                 <w:lang w:val="en-US"/>
               </w:rPr>
             </w:pPr>
-            <w:proofErr w:type="spellStart"/>
             <w:r>
               <w:rPr>
                 <w:sz w:val="24"/>
                 <w:szCs w:val="24"/>
                 <w:lang w:val="en-US"/>
               </w:rPr>
-              <w:t>setStrength</w:t>
-            </w:r>
-            <w:proofErr w:type="spellEnd"/>
-            <w:r>
-              <w:rPr>
-                <w:sz w:val="24"/>
-                <w:szCs w:val="24"/>
-                <w:lang w:val="en-US"/>
-              </w:rPr>
-              <w:t>(</w:t>
-            </w:r>
-            <w:proofErr w:type="spellStart"/>
-            <w:r>
-              <w:rPr>
-                <w:sz w:val="24"/>
-                <w:szCs w:val="24"/>
-                <w:lang w:val="en-US"/>
-              </w:rPr>
-              <w:t>p_iStrength</w:t>
-            </w:r>
-            <w:proofErr w:type="spellEnd"/>
-            <w:r>
-              <w:rPr>
-                <w:sz w:val="24"/>
-                <w:szCs w:val="24"/>
-                <w:lang w:val="en-US"/>
-              </w:rPr>
-              <w:t xml:space="preserve">: int): void  </w:t>
+              <w:t xml:space="preserve">setStrength(p_iStrength: int): void  </w:t>
             </w:r>
           </w:p>
         </w:tc>
@@ -1622,41 +1304,13 @@
                 <w:lang w:val="en-US"/>
               </w:rPr>
             </w:pPr>
-            <w:proofErr w:type="spellStart"/>
             <w:r>
               <w:rPr>
                 <w:sz w:val="24"/>
                 <w:szCs w:val="24"/>
                 <w:lang w:val="en-US"/>
               </w:rPr>
-              <w:t>improveHealth</w:t>
-            </w:r>
-            <w:proofErr w:type="spellEnd"/>
-            <w:r>
-              <w:rPr>
-                <w:sz w:val="24"/>
-                <w:szCs w:val="24"/>
-                <w:lang w:val="en-US"/>
-              </w:rPr>
-              <w:t>(</w:t>
-            </w:r>
-            <w:proofErr w:type="spellStart"/>
-            <w:r>
-              <w:rPr>
-                <w:sz w:val="24"/>
-                <w:szCs w:val="24"/>
-                <w:lang w:val="en-US"/>
-              </w:rPr>
-              <w:t>p_iValue</w:t>
-            </w:r>
-            <w:proofErr w:type="spellEnd"/>
-            <w:r>
-              <w:rPr>
-                <w:sz w:val="24"/>
-                <w:szCs w:val="24"/>
-                <w:lang w:val="en-US"/>
-              </w:rPr>
-              <w:t xml:space="preserve">: int): void  </w:t>
+              <w:t xml:space="preserve">improveHealth(p_iValue: int): void  </w:t>
             </w:r>
           </w:p>
         </w:tc>
@@ -1691,41 +1345,13 @@
                 <w:lang w:val="en-US"/>
               </w:rPr>
             </w:pPr>
-            <w:proofErr w:type="spellStart"/>
             <w:r>
               <w:rPr>
                 <w:sz w:val="24"/>
                 <w:szCs w:val="24"/>
                 <w:lang w:val="en-US"/>
               </w:rPr>
-              <w:t>improveStrength</w:t>
-            </w:r>
-            <w:proofErr w:type="spellEnd"/>
-            <w:r>
-              <w:rPr>
-                <w:sz w:val="24"/>
-                <w:szCs w:val="24"/>
-                <w:lang w:val="en-US"/>
-              </w:rPr>
-              <w:t>(</w:t>
-            </w:r>
-            <w:proofErr w:type="spellStart"/>
-            <w:r>
-              <w:rPr>
-                <w:sz w:val="24"/>
-                <w:szCs w:val="24"/>
-                <w:lang w:val="en-US"/>
-              </w:rPr>
-              <w:t>p_iValue</w:t>
-            </w:r>
-            <w:proofErr w:type="spellEnd"/>
-            <w:r>
-              <w:rPr>
-                <w:sz w:val="24"/>
-                <w:szCs w:val="24"/>
-                <w:lang w:val="en-US"/>
-              </w:rPr>
-              <w:t xml:space="preserve">: int): void  </w:t>
+              <w:t xml:space="preserve">improveStrength(p_iValue: int): void  </w:t>
             </w:r>
           </w:p>
         </w:tc>
@@ -1757,41 +1383,13 @@
                 <w:lang w:val="en-US"/>
               </w:rPr>
             </w:pPr>
-            <w:proofErr w:type="spellStart"/>
             <w:r>
               <w:rPr>
                 <w:sz w:val="24"/>
                 <w:szCs w:val="24"/>
                 <w:lang w:val="en-US"/>
               </w:rPr>
-              <w:t>searchForOptions</w:t>
-            </w:r>
-            <w:proofErr w:type="spellEnd"/>
-            <w:r>
-              <w:rPr>
-                <w:sz w:val="24"/>
-                <w:szCs w:val="24"/>
-                <w:lang w:val="en-US"/>
-              </w:rPr>
-              <w:t>(</w:t>
-            </w:r>
-            <w:proofErr w:type="spellStart"/>
-            <w:r>
-              <w:rPr>
-                <w:sz w:val="24"/>
-                <w:szCs w:val="24"/>
-                <w:lang w:val="en-US"/>
-              </w:rPr>
-              <w:t>p_Searchable</w:t>
-            </w:r>
-            <w:proofErr w:type="spellEnd"/>
-            <w:r>
-              <w:rPr>
-                <w:sz w:val="24"/>
-                <w:szCs w:val="24"/>
-                <w:lang w:val="en-US"/>
-              </w:rPr>
-              <w:t xml:space="preserve">: Searchable): void  </w:t>
+              <w:t xml:space="preserve">searchForOptions(p_Searchable: Searchable): void  </w:t>
             </w:r>
           </w:p>
         </w:tc>
@@ -1823,41 +1421,13 @@
                 <w:lang w:val="en-US"/>
               </w:rPr>
             </w:pPr>
-            <w:proofErr w:type="spellStart"/>
             <w:r>
               <w:rPr>
                 <w:sz w:val="24"/>
                 <w:szCs w:val="24"/>
                 <w:lang w:val="en-US"/>
               </w:rPr>
-              <w:t>inflictDamage</w:t>
-            </w:r>
-            <w:proofErr w:type="spellEnd"/>
-            <w:r>
-              <w:rPr>
-                <w:sz w:val="24"/>
-                <w:szCs w:val="24"/>
-                <w:lang w:val="en-US"/>
-              </w:rPr>
-              <w:t>(</w:t>
-            </w:r>
-            <w:proofErr w:type="spellStart"/>
-            <w:r>
-              <w:rPr>
-                <w:sz w:val="24"/>
-                <w:szCs w:val="24"/>
-                <w:lang w:val="en-US"/>
-              </w:rPr>
-              <w:t>p_TargetCharacter</w:t>
-            </w:r>
-            <w:proofErr w:type="spellEnd"/>
-            <w:r>
-              <w:rPr>
-                <w:sz w:val="24"/>
-                <w:szCs w:val="24"/>
-                <w:lang w:val="en-US"/>
-              </w:rPr>
-              <w:t xml:space="preserve">: Character): void  </w:t>
+              <w:t xml:space="preserve">inflictDamage(p_TargetCharacter: Character): void  </w:t>
             </w:r>
           </w:p>
         </w:tc>
@@ -1892,41 +1462,13 @@
                 <w:lang w:val="en-US"/>
               </w:rPr>
             </w:pPr>
-            <w:proofErr w:type="spellStart"/>
             <w:r>
               <w:rPr>
                 <w:sz w:val="24"/>
                 <w:szCs w:val="24"/>
                 <w:lang w:val="en-US"/>
               </w:rPr>
-              <w:t>inflictDamage</w:t>
-            </w:r>
-            <w:proofErr w:type="spellEnd"/>
-            <w:r>
-              <w:rPr>
-                <w:sz w:val="24"/>
-                <w:szCs w:val="24"/>
-                <w:lang w:val="en-US"/>
-              </w:rPr>
-              <w:t>(</w:t>
-            </w:r>
-            <w:proofErr w:type="spellStart"/>
-            <w:r>
-              <w:rPr>
-                <w:sz w:val="24"/>
-                <w:szCs w:val="24"/>
-                <w:lang w:val="en-US"/>
-              </w:rPr>
-              <w:t>p_TargetCharacter</w:t>
-            </w:r>
-            <w:proofErr w:type="spellEnd"/>
-            <w:r>
-              <w:rPr>
-                <w:sz w:val="24"/>
-                <w:szCs w:val="24"/>
-                <w:lang w:val="en-US"/>
-              </w:rPr>
-              <w:t xml:space="preserve">: Character): void  </w:t>
+              <w:t xml:space="preserve">inflictDamage(p_TargetCharacter: Character): void  </w:t>
             </w:r>
           </w:p>
         </w:tc>
@@ -1961,7 +1503,6 @@
                 <w:lang w:val="en-US"/>
               </w:rPr>
             </w:pPr>
-            <w:proofErr w:type="spellStart"/>
             <w:r>
               <w:rPr>
                 <w:sz w:val="24"/>
@@ -1969,34 +1510,7 @@
                 <w:lang w:val="en-US"/>
               </w:rPr>
               <w:lastRenderedPageBreak/>
-              <w:t>setAttackBonus</w:t>
-            </w:r>
-            <w:proofErr w:type="spellEnd"/>
-            <w:r>
-              <w:rPr>
-                <w:sz w:val="24"/>
-                <w:szCs w:val="24"/>
-                <w:lang w:val="en-US"/>
-              </w:rPr>
-              <w:t>(</w:t>
-            </w:r>
-            <w:proofErr w:type="spellStart"/>
-            <w:r>
-              <w:rPr>
-                <w:sz w:val="24"/>
-                <w:szCs w:val="24"/>
-                <w:lang w:val="en-US"/>
-              </w:rPr>
-              <w:t>p_iBonus</w:t>
-            </w:r>
-            <w:proofErr w:type="spellEnd"/>
-            <w:r>
-              <w:rPr>
-                <w:sz w:val="24"/>
-                <w:szCs w:val="24"/>
-                <w:lang w:val="en-US"/>
-              </w:rPr>
-              <w:t xml:space="preserve">: int): void  </w:t>
+              <w:t xml:space="preserve">setAttackBonus(p_iBonus: int): void  </w:t>
             </w:r>
           </w:p>
         </w:tc>
@@ -2651,53 +2165,16 @@
           <w:szCs w:val="24"/>
         </w:rPr>
       </w:pPr>
-      <w:proofErr w:type="spellStart"/>
-      <w:r>
-        <w:rPr>
-          <w:rFonts w:ascii="Segoe UI Emoji" w:hAnsi="Segoe UI Emoji" w:cs="Segoe UI Emoji"/>
-          <w:b/>
-          <w:bCs/>
-          <w:color w:val="00B050"/>
-          <w:sz w:val="24"/>
-          <w:szCs w:val="24"/>
-        </w:rPr>
-        <w:t>isWeaponEfficient</w:t>
-      </w:r>
-      <w:proofErr w:type="spellEnd"/>
-      <w:r>
-        <w:rPr>
-          <w:rFonts w:ascii="Segoe UI Emoji" w:hAnsi="Segoe UI Emoji" w:cs="Segoe UI Emoji"/>
-          <w:b/>
-          <w:bCs/>
-          <w:color w:val="00B050"/>
-          <w:sz w:val="24"/>
-          <w:szCs w:val="24"/>
-        </w:rPr>
-        <w:t>(</w:t>
-      </w:r>
-      <w:proofErr w:type="spellStart"/>
-      <w:r>
-        <w:rPr>
-          <w:rFonts w:ascii="Segoe UI Emoji" w:hAnsi="Segoe UI Emoji" w:cs="Segoe UI Emoji"/>
-          <w:b/>
-          <w:bCs/>
-          <w:color w:val="00B050"/>
-          <w:sz w:val="24"/>
-          <w:szCs w:val="24"/>
-        </w:rPr>
-        <w:t>weapon</w:t>
-      </w:r>
-      <w:proofErr w:type="spellEnd"/>
-      <w:r>
-        <w:rPr>
-          <w:rFonts w:ascii="Segoe UI Emoji" w:hAnsi="Segoe UI Emoji" w:cs="Segoe UI Emoji"/>
-          <w:b/>
-          <w:bCs/>
-          <w:color w:val="00B050"/>
-          <w:sz w:val="24"/>
-          <w:szCs w:val="24"/>
-        </w:rPr>
-        <w:t xml:space="preserve">)  </w:t>
+      <w:r>
+        <w:rPr>
+          <w:rFonts w:ascii="Segoe UI Emoji" w:hAnsi="Segoe UI Emoji" w:cs="Segoe UI Emoji"/>
+          <w:b/>
+          <w:bCs/>
+          <w:color w:val="00B050"/>
+          <w:sz w:val="24"/>
+          <w:szCs w:val="24"/>
+        </w:rPr>
+        <w:t xml:space="preserve">isWeaponEfficient(weapon)  </w:t>
       </w:r>
     </w:p>
     <w:p>
@@ -3661,7 +3138,6 @@
           <w:szCs w:val="24"/>
         </w:rPr>
       </w:pPr>
-      <w:proofErr w:type="spellStart"/>
       <w:r>
         <w:rPr>
           <w:rFonts w:ascii="Segoe UI Emoji" w:hAnsi="Segoe UI Emoji" w:cs="Segoe UI Emoji"/>
@@ -3671,43 +3147,7 @@
           <w:sz w:val="24"/>
           <w:szCs w:val="24"/>
         </w:rPr>
-        <w:t>attack</w:t>
-      </w:r>
-      <w:proofErr w:type="spellEnd"/>
-      <w:r>
-        <w:rPr>
-          <w:rFonts w:ascii="Segoe UI Emoji" w:hAnsi="Segoe UI Emoji" w:cs="Segoe UI Emoji"/>
-          <w:b/>
-          <w:bCs/>
-          <w:color w:val="EE0000"/>
-          <w:sz w:val="24"/>
-          <w:szCs w:val="24"/>
-        </w:rPr>
-        <w:t>(</w:t>
-      </w:r>
-      <w:proofErr w:type="spellStart"/>
-      <w:r>
-        <w:rPr>
-          <w:rFonts w:ascii="Segoe UI Emoji" w:hAnsi="Segoe UI Emoji" w:cs="Segoe UI Emoji"/>
-          <w:b/>
-          <w:bCs/>
-          <w:color w:val="EE0000"/>
-          <w:sz w:val="24"/>
-          <w:szCs w:val="24"/>
-        </w:rPr>
-        <w:t>targetEnemy</w:t>
-      </w:r>
-      <w:proofErr w:type="spellEnd"/>
-      <w:r>
-        <w:rPr>
-          <w:rFonts w:ascii="Segoe UI Emoji" w:hAnsi="Segoe UI Emoji" w:cs="Segoe UI Emoji"/>
-          <w:b/>
-          <w:bCs/>
-          <w:color w:val="EE0000"/>
-          <w:sz w:val="24"/>
-          <w:szCs w:val="24"/>
-        </w:rPr>
-        <w:t xml:space="preserve">)  </w:t>
+        <w:t xml:space="preserve">attack(targetEnemy)  </w:t>
       </w:r>
     </w:p>
     <w:p>
@@ -3909,7 +3349,6 @@
         </w:rPr>
         <w:t>+</w:t>
       </w:r>
-      <w:proofErr w:type="spellStart"/>
       <w:r>
         <w:rPr>
           <w:rFonts w:ascii="Segoe UI Emoji" w:hAnsi="Segoe UI Emoji" w:cs="Segoe UI Emoji"/>
@@ -3938,107 +3377,38 @@
           <w:sz w:val="24"/>
           <w:szCs w:val="24"/>
         </w:rPr>
-        <w:t>tions</w:t>
-      </w:r>
-      <w:proofErr w:type="spellEnd"/>
-      <w:r>
-        <w:rPr>
-          <w:rFonts w:ascii="Segoe UI Emoji" w:hAnsi="Segoe UI Emoji" w:cs="Segoe UI Emoji"/>
-          <w:b/>
-          <w:bCs/>
-          <w:sz w:val="24"/>
-          <w:szCs w:val="24"/>
-        </w:rPr>
-        <w:t>(</w:t>
-      </w:r>
-      <w:proofErr w:type="spellStart"/>
-      <w:r>
-        <w:rPr>
-          <w:rFonts w:ascii="Segoe UI Emoji" w:hAnsi="Segoe UI Emoji" w:cs="Segoe UI Emoji"/>
-          <w:b/>
-          <w:bCs/>
-          <w:sz w:val="24"/>
-          <w:szCs w:val="24"/>
-        </w:rPr>
-        <w:t>p_Searchable</w:t>
-      </w:r>
-      <w:proofErr w:type="spellEnd"/>
-      <w:r>
-        <w:rPr>
-          <w:rFonts w:ascii="Segoe UI Emoji" w:hAnsi="Segoe UI Emoji" w:cs="Segoe UI Emoji"/>
-          <w:b/>
-          <w:bCs/>
-          <w:sz w:val="24"/>
-          <w:szCs w:val="24"/>
-        </w:rPr>
-        <w:t xml:space="preserve"> </w:t>
-      </w:r>
-      <w:proofErr w:type="spellStart"/>
-      <w:r>
-        <w:rPr>
-          <w:rFonts w:ascii="Segoe UI Emoji" w:hAnsi="Segoe UI Emoji" w:cs="Segoe UI Emoji"/>
-          <w:b/>
-          <w:bCs/>
-          <w:sz w:val="24"/>
-          <w:szCs w:val="24"/>
-        </w:rPr>
-        <w:t>S</w:t>
-      </w:r>
-      <w:r>
-        <w:rPr>
-          <w:rFonts w:ascii="Segoe UI Emoji" w:hAnsi="Segoe UI Emoji" w:cs="Segoe UI Emoji"/>
-          <w:b/>
-          <w:bCs/>
-          <w:sz w:val="24"/>
-          <w:szCs w:val="24"/>
-        </w:rPr>
-        <w:t>earchable</w:t>
-      </w:r>
-      <w:proofErr w:type="spellEnd"/>
-      <w:r>
-        <w:rPr>
-          <w:rFonts w:ascii="Segoe UI Emoji" w:hAnsi="Segoe UI Emoji" w:cs="Segoe UI Emoji"/>
-          <w:b/>
-          <w:bCs/>
-          <w:sz w:val="24"/>
-          <w:szCs w:val="24"/>
-        </w:rPr>
-        <w:t xml:space="preserve">)  </w:t>
-      </w:r>
-      <w:proofErr w:type="spellStart"/>
-      <w:r>
-        <w:rPr>
-          <w:rFonts w:ascii="Segoe UI Emoji" w:hAnsi="Segoe UI Emoji" w:cs="Segoe UI Emoji"/>
-          <w:b/>
-          <w:bCs/>
-          <w:sz w:val="24"/>
-          <w:szCs w:val="24"/>
-        </w:rPr>
-        <w:t>p_Searchable</w:t>
-      </w:r>
-      <w:proofErr w:type="spellEnd"/>
-      <w:r>
-        <w:rPr>
-          <w:rFonts w:ascii="Segoe UI Emoji" w:hAnsi="Segoe UI Emoji" w:cs="Segoe UI Emoji"/>
-          <w:b/>
-          <w:bCs/>
-          <w:sz w:val="24"/>
-          <w:szCs w:val="24"/>
-        </w:rPr>
-        <w:t xml:space="preserve"> = objet </w:t>
-      </w:r>
-      <w:proofErr w:type="spellStart"/>
-      <w:r>
-        <w:rPr>
-          <w:rFonts w:ascii="Segoe UI Emoji" w:hAnsi="Segoe UI Emoji" w:cs="Segoe UI Emoji"/>
-          <w:b/>
-          <w:bCs/>
-          <w:sz w:val="24"/>
-          <w:szCs w:val="24"/>
-        </w:rPr>
-        <w:t>fouillable</w:t>
-      </w:r>
-      <w:proofErr w:type="spellEnd"/>
+        <w:t>tions(</w:t>
+      </w:r>
+      <w:r>
+        <w:rPr>
+          <w:rFonts w:ascii="Segoe UI Emoji" w:hAnsi="Segoe UI Emoji" w:cs="Segoe UI Emoji"/>
+          <w:b/>
+          <w:bCs/>
+          <w:sz w:val="24"/>
+          <w:szCs w:val="24"/>
+        </w:rPr>
+        <w:t>p_Searchable S</w:t>
+      </w:r>
+      <w:r>
+        <w:rPr>
+          <w:rFonts w:ascii="Segoe UI Emoji" w:hAnsi="Segoe UI Emoji" w:cs="Segoe UI Emoji"/>
+          <w:b/>
+          <w:bCs/>
+          <w:sz w:val="24"/>
+          <w:szCs w:val="24"/>
+        </w:rPr>
+        <w:t xml:space="preserve">earchable)  </w:t>
+      </w:r>
+      <w:r>
+        <w:rPr>
+          <w:rFonts w:ascii="Segoe UI Emoji" w:hAnsi="Segoe UI Emoji" w:cs="Segoe UI Emoji"/>
+          <w:b/>
+          <w:bCs/>
+          <w:sz w:val="24"/>
+          <w:szCs w:val="24"/>
+        </w:rPr>
+        <w:t>p_Searchable = objet fouillable</w:t>
+      </w:r>
     </w:p>
     <w:p>
       <w:pPr>
@@ -4126,7 +3496,6 @@
           <w:szCs w:val="24"/>
         </w:rPr>
       </w:pPr>
-      <w:proofErr w:type="spellStart"/>
       <w:r>
         <w:rPr>
           <w:rFonts w:ascii="Segoe UI Emoji" w:hAnsi="Segoe UI Emoji" w:cs="Segoe UI Emoji"/>
@@ -4134,37 +3503,7 @@
           <w:szCs w:val="24"/>
           <w:highlight w:val="yellow"/>
         </w:rPr>
-        <w:t>Trypower</w:t>
-      </w:r>
-      <w:proofErr w:type="spellEnd"/>
-      <w:r>
-        <w:rPr>
-          <w:rFonts w:ascii="Segoe UI Emoji" w:hAnsi="Segoe UI Emoji" w:cs="Segoe UI Emoji"/>
-          <w:sz w:val="24"/>
-          <w:szCs w:val="24"/>
-          <w:highlight w:val="yellow"/>
-        </w:rPr>
-        <w:t xml:space="preserve"> sur l’</w:t>
-      </w:r>
-      <w:proofErr w:type="spellStart"/>
-      <w:r>
-        <w:rPr>
-          <w:rFonts w:ascii="Segoe UI Emoji" w:hAnsi="Segoe UI Emoji" w:cs="Segoe UI Emoji"/>
-          <w:sz w:val="24"/>
-          <w:szCs w:val="24"/>
-          <w:highlight w:val="yellow"/>
-        </w:rPr>
-        <w:t>uml</w:t>
-      </w:r>
-      <w:proofErr w:type="spellEnd"/>
-      <w:r>
-        <w:rPr>
-          <w:rFonts w:ascii="Segoe UI Emoji" w:hAnsi="Segoe UI Emoji" w:cs="Segoe UI Emoji"/>
-          <w:sz w:val="24"/>
-          <w:szCs w:val="24"/>
-          <w:highlight w:val="yellow"/>
-        </w:rPr>
-        <w:t xml:space="preserve"> main</w:t>
+        <w:t>Trypower sur l’uml main</w:t>
       </w:r>
     </w:p>
     <w:p>
@@ -4484,158 +3823,41 @@
           <w:szCs w:val="24"/>
           <w:lang w:val="en-US"/>
         </w:rPr>
-        <w:t>-</w:t>
-      </w:r>
-      <w:proofErr w:type="spellStart"/>
-      <w:r>
-        <w:rPr>
-          <w:rFonts w:ascii="Segoe UI Emoji" w:hAnsi="Segoe UI Emoji" w:cs="Segoe UI Emoji"/>
-          <w:sz w:val="24"/>
-          <w:szCs w:val="24"/>
-          <w:lang w:val="en-US"/>
-        </w:rPr>
-        <w:t>appel</w:t>
-      </w:r>
-      <w:proofErr w:type="spellEnd"/>
-      <w:r>
-        <w:rPr>
-          <w:rFonts w:ascii="Segoe UI Emoji" w:hAnsi="Segoe UI Emoji" w:cs="Segoe UI Emoji"/>
-          <w:sz w:val="24"/>
-          <w:szCs w:val="24"/>
-          <w:lang w:val="en-US"/>
-        </w:rPr>
-        <w:t xml:space="preserve"> Character </w:t>
-      </w:r>
-      <w:proofErr w:type="spellStart"/>
-      <w:r>
-        <w:rPr>
-          <w:rFonts w:ascii="Segoe UI Emoji" w:hAnsi="Segoe UI Emoji" w:cs="Segoe UI Emoji"/>
-          <w:sz w:val="24"/>
-          <w:szCs w:val="24"/>
-          <w:lang w:val="en-US"/>
-        </w:rPr>
-        <w:t>receiveDamage</w:t>
-      </w:r>
-      <w:proofErr w:type="spellEnd"/>
-      <w:r>
-        <w:rPr>
-          <w:rFonts w:ascii="Segoe UI Emoji" w:hAnsi="Segoe UI Emoji" w:cs="Segoe UI Emoji"/>
-          <w:sz w:val="24"/>
-          <w:szCs w:val="24"/>
-          <w:lang w:val="en-US"/>
-        </w:rPr>
-        <w:t xml:space="preserve">(int </w:t>
-      </w:r>
-      <w:proofErr w:type="spellStart"/>
-      <w:r>
-        <w:rPr>
-          <w:rFonts w:ascii="Segoe UI Emoji" w:hAnsi="Segoe UI Emoji" w:cs="Segoe UI Emoji"/>
-          <w:sz w:val="24"/>
-          <w:szCs w:val="24"/>
-          <w:lang w:val="en-US"/>
-        </w:rPr>
-        <w:t>dégats</w:t>
-      </w:r>
-      <w:proofErr w:type="spellEnd"/>
-      <w:r>
-        <w:rPr>
-          <w:rFonts w:ascii="Segoe UI Emoji" w:hAnsi="Segoe UI Emoji" w:cs="Segoe UI Emoji"/>
-          <w:sz w:val="24"/>
-          <w:szCs w:val="24"/>
-          <w:lang w:val="en-US"/>
-        </w:rPr>
-        <w:t>) //</w:t>
-      </w:r>
-      <w:proofErr w:type="spellStart"/>
-      <w:r>
-        <w:rPr>
-          <w:rFonts w:ascii="Segoe UI Emoji" w:hAnsi="Segoe UI Emoji" w:cs="Segoe UI Emoji"/>
-          <w:sz w:val="24"/>
-          <w:szCs w:val="24"/>
-          <w:lang w:val="en-US"/>
-        </w:rPr>
-        <w:t>Weapon.inflictDamage</w:t>
-      </w:r>
-      <w:proofErr w:type="spellEnd"/>
-      <w:r>
-        <w:rPr>
-          <w:rFonts w:ascii="Segoe UI Emoji" w:hAnsi="Segoe UI Emoji" w:cs="Segoe UI Emoji"/>
-          <w:sz w:val="24"/>
-          <w:szCs w:val="24"/>
-          <w:lang w:val="en-US"/>
-        </w:rPr>
-        <w:t>(target)</w:t>
-      </w:r>
-    </w:p>
-    <w:p>
-      <w:pPr>
-        <w:rPr>
-          <w:rFonts w:ascii="Segoe UI Emoji" w:hAnsi="Segoe UI Emoji" w:cs="Segoe UI Emoji"/>
-          <w:b/>
-          <w:bCs/>
-          <w:color w:val="00B050"/>
-          <w:sz w:val="24"/>
-          <w:szCs w:val="24"/>
-        </w:rPr>
-      </w:pPr>
-      <w:proofErr w:type="spellStart"/>
-      <w:r>
-        <w:rPr>
-          <w:rFonts w:ascii="Segoe UI Emoji" w:hAnsi="Segoe UI Emoji" w:cs="Segoe UI Emoji"/>
-          <w:b/>
-          <w:bCs/>
-          <w:color w:val="00B050"/>
-          <w:sz w:val="24"/>
-          <w:szCs w:val="24"/>
-        </w:rPr>
-        <w:t>setAttackBonus</w:t>
-      </w:r>
-      <w:proofErr w:type="spellEnd"/>
-      <w:r>
-        <w:rPr>
-          <w:rFonts w:ascii="Segoe UI Emoji" w:hAnsi="Segoe UI Emoji" w:cs="Segoe UI Emoji"/>
-          <w:b/>
-          <w:bCs/>
-          <w:color w:val="00B050"/>
-          <w:sz w:val="24"/>
-          <w:szCs w:val="24"/>
-        </w:rPr>
-        <w:t xml:space="preserve">(bonus)  </w:t>
-      </w:r>
-      <w:r>
-        <w:rPr>
-          <w:rFonts w:ascii="Segoe UI Emoji" w:hAnsi="Segoe UI Emoji" w:cs="Segoe UI Emoji"/>
-          <w:b/>
-          <w:bCs/>
-          <w:color w:val="00B050"/>
-          <w:sz w:val="24"/>
-          <w:szCs w:val="24"/>
-        </w:rPr>
-        <w:t xml:space="preserve">X maintenant </w:t>
-      </w:r>
-      <w:proofErr w:type="spellStart"/>
-      <w:r>
-        <w:rPr>
-          <w:rFonts w:ascii="Segoe UI Emoji" w:hAnsi="Segoe UI Emoji" w:cs="Segoe UI Emoji"/>
-          <w:b/>
-          <w:bCs/>
-          <w:color w:val="00B050"/>
-          <w:sz w:val="24"/>
-          <w:szCs w:val="24"/>
-        </w:rPr>
-        <w:t>setAttackBonus</w:t>
-      </w:r>
-      <w:proofErr w:type="spellEnd"/>
-      <w:r>
-        <w:rPr>
-          <w:rFonts w:ascii="Segoe UI Emoji" w:hAnsi="Segoe UI Emoji" w:cs="Segoe UI Emoji"/>
-          <w:b/>
-          <w:bCs/>
-          <w:color w:val="00B050"/>
-          <w:sz w:val="24"/>
-          <w:szCs w:val="24"/>
-        </w:rPr>
-        <w:t>()</w:t>
+        <w:t>-appel Character receiveDamage(int dégats) //Weapon.inflictDamage(target)</w:t>
+      </w:r>
+    </w:p>
+    <w:p>
+      <w:pPr>
+        <w:rPr>
+          <w:rFonts w:ascii="Segoe UI Emoji" w:hAnsi="Segoe UI Emoji" w:cs="Segoe UI Emoji"/>
+          <w:b/>
+          <w:bCs/>
+          <w:color w:val="00B050"/>
+          <w:sz w:val="24"/>
+          <w:szCs w:val="24"/>
+        </w:rPr>
+      </w:pPr>
+      <w:r>
+        <w:rPr>
+          <w:rFonts w:ascii="Segoe UI Emoji" w:hAnsi="Segoe UI Emoji" w:cs="Segoe UI Emoji"/>
+          <w:b/>
+          <w:bCs/>
+          <w:color w:val="00B050"/>
+          <w:sz w:val="24"/>
+          <w:szCs w:val="24"/>
+        </w:rPr>
+        <w:t xml:space="preserve">setAttackBonus(bonus)  </w:t>
+      </w:r>
+      <w:r>
+        <w:rPr>
+          <w:rFonts w:ascii="Segoe UI Emoji" w:hAnsi="Segoe UI Emoji" w:cs="Segoe UI Emoji"/>
+          <w:b/>
+          <w:bCs/>
+          <w:color w:val="00B050"/>
+          <w:sz w:val="24"/>
+          <w:szCs w:val="24"/>
+        </w:rPr>
+        <w:t>X maintenant setAttackBonus()</w:t>
       </w:r>
     </w:p>
     <w:p>
@@ -4892,43 +4114,7 @@
           <w:sz w:val="24"/>
           <w:szCs w:val="24"/>
         </w:rPr>
-        <w:t xml:space="preserve">-Système de fuit comme sur pokémon ou </w:t>
-      </w:r>
-      <w:proofErr w:type="spellStart"/>
-      <w:r>
-        <w:rPr>
-          <w:rFonts w:ascii="Segoe UI Emoji" w:hAnsi="Segoe UI Emoji" w:cs="Segoe UI Emoji"/>
-          <w:sz w:val="24"/>
-          <w:szCs w:val="24"/>
-        </w:rPr>
-        <w:t>mario</w:t>
-      </w:r>
-      <w:proofErr w:type="spellEnd"/>
-      <w:r>
-        <w:rPr>
-          <w:rFonts w:ascii="Segoe UI Emoji" w:hAnsi="Segoe UI Emoji" w:cs="Segoe UI Emoji"/>
-          <w:sz w:val="24"/>
-          <w:szCs w:val="24"/>
-        </w:rPr>
-        <w:t xml:space="preserve"> </w:t>
-      </w:r>
-      <w:proofErr w:type="spellStart"/>
-      <w:r>
-        <w:rPr>
-          <w:rFonts w:ascii="Segoe UI Emoji" w:hAnsi="Segoe UI Emoji" w:cs="Segoe UI Emoji"/>
-          <w:sz w:val="24"/>
-          <w:szCs w:val="24"/>
-        </w:rPr>
-        <w:t>paper</w:t>
-      </w:r>
-      <w:proofErr w:type="spellEnd"/>
-      <w:r>
-        <w:rPr>
-          <w:rFonts w:ascii="Segoe UI Emoji" w:hAnsi="Segoe UI Emoji" w:cs="Segoe UI Emoji"/>
-          <w:sz w:val="24"/>
-          <w:szCs w:val="24"/>
-        </w:rPr>
-        <w:t xml:space="preserve"> </w:t>
+        <w:t xml:space="preserve">-Système de fuit comme sur pokémon ou mario paper </w:t>
       </w:r>
     </w:p>
     <w:p>
@@ -4962,60 +4148,24 @@
           <w:sz w:val="24"/>
           <w:szCs w:val="24"/>
         </w:rPr>
-        <w:t xml:space="preserve">-Ne pas donner la bonne arme, laisser le héro choisir son arme donc système d’inventaire pour le </w:t>
-      </w:r>
-      <w:proofErr w:type="spellStart"/>
-      <w:r>
-        <w:rPr>
-          <w:rFonts w:ascii="Segoe UI Emoji" w:hAnsi="Segoe UI Emoji" w:cs="Segoe UI Emoji"/>
-          <w:sz w:val="24"/>
-          <w:szCs w:val="24"/>
-        </w:rPr>
-        <w:t>héro</w:t>
-      </w:r>
-      <w:proofErr w:type="spellEnd"/>
-      <w:r>
-        <w:rPr>
-          <w:rFonts w:ascii="Segoe UI Emoji" w:hAnsi="Segoe UI Emoji" w:cs="Segoe UI Emoji"/>
-          <w:sz w:val="24"/>
-          <w:szCs w:val="24"/>
-        </w:rPr>
-        <w:t>. Peut changer entre chaque round</w:t>
-      </w:r>
-    </w:p>
-    <w:p>
-      <w:pPr>
-        <w:rPr>
-          <w:rFonts w:ascii="Segoe UI Emoji" w:hAnsi="Segoe UI Emoji" w:cs="Segoe UI Emoji"/>
-          <w:sz w:val="24"/>
-          <w:szCs w:val="24"/>
-        </w:rPr>
-      </w:pPr>
-      <w:r>
-        <w:rPr>
-          <w:rFonts w:ascii="Segoe UI Emoji" w:hAnsi="Segoe UI Emoji" w:cs="Segoe UI Emoji"/>
-          <w:sz w:val="24"/>
-          <w:szCs w:val="24"/>
-        </w:rPr>
-        <w:t xml:space="preserve">-Faire un tuto au début en mode </w:t>
-      </w:r>
-      <w:proofErr w:type="spellStart"/>
-      <w:r>
-        <w:rPr>
-          <w:rFonts w:ascii="Segoe UI Emoji" w:hAnsi="Segoe UI Emoji" w:cs="Segoe UI Emoji"/>
-          <w:sz w:val="24"/>
-          <w:szCs w:val="24"/>
-        </w:rPr>
-        <w:t>écriver</w:t>
-      </w:r>
-      <w:proofErr w:type="spellEnd"/>
-      <w:r>
-        <w:rPr>
-          <w:rFonts w:ascii="Segoe UI Emoji" w:hAnsi="Segoe UI Emoji" w:cs="Segoe UI Emoji"/>
-          <w:sz w:val="24"/>
-          <w:szCs w:val="24"/>
-        </w:rPr>
-        <w:t xml:space="preserve"> arme pour l’utiliser </w:t>
+        <w:t>-Ne pas donner la bonne arme, laisser le héro choisir son arme donc système d’inventaire pour le héro. Peut changer entre chaque round</w:t>
+      </w:r>
+    </w:p>
+    <w:p>
+      <w:pPr>
+        <w:rPr>
+          <w:rFonts w:ascii="Segoe UI Emoji" w:hAnsi="Segoe UI Emoji" w:cs="Segoe UI Emoji"/>
+          <w:sz w:val="24"/>
+          <w:szCs w:val="24"/>
+        </w:rPr>
+      </w:pPr>
+      <w:r>
+        <w:rPr>
+          <w:rFonts w:ascii="Segoe UI Emoji" w:hAnsi="Segoe UI Emoji" w:cs="Segoe UI Emoji"/>
+          <w:sz w:val="24"/>
+          <w:szCs w:val="24"/>
+        </w:rPr>
+        <w:t xml:space="preserve">-Faire un tuto au début en mode écriver arme pour l’utiliser </w:t>
       </w:r>
     </w:p>
     <w:p>
@@ -5049,95 +4199,229 @@
           <w:sz w:val="24"/>
           <w:szCs w:val="24"/>
         </w:rPr>
-        <w:t xml:space="preserve">-Faire </w:t>
-      </w:r>
-      <w:proofErr w:type="spellStart"/>
-      <w:r>
-        <w:rPr>
-          <w:rFonts w:ascii="Segoe UI Emoji" w:hAnsi="Segoe UI Emoji" w:cs="Segoe UI Emoji"/>
-          <w:sz w:val="24"/>
-          <w:szCs w:val="24"/>
-        </w:rPr>
-        <w:t>uen</w:t>
-      </w:r>
-      <w:proofErr w:type="spellEnd"/>
-      <w:r>
-        <w:rPr>
-          <w:rFonts w:ascii="Segoe UI Emoji" w:hAnsi="Segoe UI Emoji" w:cs="Segoe UI Emoji"/>
-          <w:sz w:val="24"/>
-          <w:szCs w:val="24"/>
-        </w:rPr>
-        <w:t xml:space="preserve"> méthode </w:t>
-      </w:r>
-      <w:proofErr w:type="spellStart"/>
-      <w:r>
-        <w:rPr>
-          <w:rFonts w:ascii="Segoe UI Emoji" w:hAnsi="Segoe UI Emoji" w:cs="Segoe UI Emoji"/>
-          <w:sz w:val="24"/>
-          <w:szCs w:val="24"/>
-        </w:rPr>
-        <w:t>selectméthode</w:t>
-      </w:r>
-      <w:proofErr w:type="spellEnd"/>
-      <w:r>
-        <w:rPr>
-          <w:rFonts w:ascii="Segoe UI Emoji" w:hAnsi="Segoe UI Emoji" w:cs="Segoe UI Emoji"/>
-          <w:sz w:val="24"/>
-          <w:szCs w:val="24"/>
-        </w:rPr>
-        <w:t xml:space="preserve"> pour </w:t>
-      </w:r>
-      <w:proofErr w:type="spellStart"/>
-      <w:r>
-        <w:rPr>
-          <w:rFonts w:ascii="Segoe UI Emoji" w:hAnsi="Segoe UI Emoji" w:cs="Segoe UI Emoji"/>
-          <w:sz w:val="24"/>
-          <w:szCs w:val="24"/>
-        </w:rPr>
-        <w:t>character</w:t>
-      </w:r>
-      <w:proofErr w:type="spellEnd"/>
-      <w:r>
-        <w:rPr>
-          <w:rFonts w:ascii="Segoe UI Emoji" w:hAnsi="Segoe UI Emoji" w:cs="Segoe UI Emoji"/>
-          <w:sz w:val="24"/>
-          <w:szCs w:val="24"/>
-        </w:rPr>
-        <w:t xml:space="preserve"> comme ça monstre pourra « choisir «  son arme</w:t>
-      </w:r>
-    </w:p>
-    <w:p>
-      <w:pPr>
-        <w:rPr>
-          <w:sz w:val="24"/>
-          <w:szCs w:val="24"/>
-        </w:rPr>
-      </w:pPr>
-      <w:r>
-        <w:rPr>
-          <w:rFonts w:ascii="Segoe UI Emoji" w:hAnsi="Segoe UI Emoji" w:cs="Segoe UI Emoji"/>
-          <w:sz w:val="24"/>
-          <w:szCs w:val="24"/>
-        </w:rPr>
-        <w:t xml:space="preserve">-Faire des </w:t>
-      </w:r>
-      <w:proofErr w:type="spellStart"/>
-      <w:r>
-        <w:rPr>
-          <w:rFonts w:ascii="Segoe UI Emoji" w:hAnsi="Segoe UI Emoji" w:cs="Segoe UI Emoji"/>
-          <w:sz w:val="24"/>
-          <w:szCs w:val="24"/>
-        </w:rPr>
-        <w:t>get</w:t>
-      </w:r>
-      <w:proofErr w:type="spellEnd"/>
-      <w:r>
-        <w:rPr>
-          <w:rFonts w:ascii="Segoe UI Emoji" w:hAnsi="Segoe UI Emoji" w:cs="Segoe UI Emoji"/>
-          <w:sz w:val="24"/>
-          <w:szCs w:val="24"/>
-        </w:rPr>
-        <w:t xml:space="preserve"> Life point pour tout le monde </w:t>
+        <w:t>-Faire uen méthode selectméthode pour character comme ça monstre pourra « choisir «  son arme</w:t>
+      </w:r>
+    </w:p>
+    <w:p>
+      <w:pPr>
+        <w:rPr>
+          <w:rFonts w:ascii="Segoe UI Emoji" w:hAnsi="Segoe UI Emoji" w:cs="Segoe UI Emoji"/>
+          <w:sz w:val="24"/>
+          <w:szCs w:val="24"/>
+        </w:rPr>
+      </w:pPr>
+      <w:r>
+        <w:rPr>
+          <w:rFonts w:ascii="Segoe UI Emoji" w:hAnsi="Segoe UI Emoji" w:cs="Segoe UI Emoji"/>
+          <w:sz w:val="24"/>
+          <w:szCs w:val="24"/>
+        </w:rPr>
+        <w:t xml:space="preserve">-Faire des get Life point pour tout le monde </w:t>
+      </w:r>
+    </w:p>
+    <w:p>
+      <w:pPr>
+        <w:rPr>
+          <w:rFonts w:ascii="Segoe UI Emoji" w:hAnsi="Segoe UI Emoji" w:cs="Segoe UI Emoji"/>
+          <w:sz w:val="24"/>
+          <w:szCs w:val="24"/>
+        </w:rPr>
+      </w:pPr>
+    </w:p>
+    <w:p>
+      <w:pPr>
+        <w:rPr>
+          <w:rFonts w:ascii="Segoe UI Emoji" w:hAnsi="Segoe UI Emoji" w:cs="Segoe UI Emoji"/>
+          <w:sz w:val="24"/>
+          <w:szCs w:val="24"/>
+        </w:rPr>
+      </w:pPr>
+      <w:r>
+        <w:rPr>
+          <w:rFonts w:ascii="Segoe UI Emoji" w:hAnsi="Segoe UI Emoji" w:cs="Segoe UI Emoji"/>
+          <w:sz w:val="24"/>
+          <w:szCs w:val="24"/>
+        </w:rPr>
+        <w:t>Déroulement monstres :</w:t>
+      </w:r>
+    </w:p>
+    <w:p>
+      <w:pPr>
+        <w:rPr>
+          <w:rFonts w:ascii="Segoe UI Emoji" w:hAnsi="Segoe UI Emoji" w:cs="Segoe UI Emoji"/>
+          <w:sz w:val="24"/>
+          <w:szCs w:val="24"/>
+        </w:rPr>
+      </w:pPr>
+      <w:r>
+        <w:rPr>
+          <w:rFonts w:ascii="Segoe UI Emoji" w:hAnsi="Segoe UI Emoji" w:cs="Segoe UI Emoji"/>
+          <w:sz w:val="24"/>
+          <w:szCs w:val="24"/>
+        </w:rPr>
+        <w:t>Barbare</w:t>
+      </w:r>
+    </w:p>
+    <w:p>
+      <w:pPr>
+        <w:rPr>
+          <w:rFonts w:ascii="Segoe UI Emoji" w:hAnsi="Segoe UI Emoji" w:cs="Segoe UI Emoji"/>
+          <w:sz w:val="24"/>
+          <w:szCs w:val="24"/>
+        </w:rPr>
+      </w:pPr>
+      <w:r>
+        <w:rPr>
+          <w:rFonts w:ascii="Segoe UI Emoji" w:hAnsi="Segoe UI Emoji" w:cs="Segoe UI Emoji"/>
+          <w:sz w:val="24"/>
+          <w:szCs w:val="24"/>
+        </w:rPr>
+        <w:t>Zombie</w:t>
+      </w:r>
+    </w:p>
+    <w:p>
+      <w:pPr>
+        <w:rPr>
+          <w:rFonts w:ascii="Segoe UI Emoji" w:hAnsi="Segoe UI Emoji" w:cs="Segoe UI Emoji"/>
+          <w:sz w:val="24"/>
+          <w:szCs w:val="24"/>
+        </w:rPr>
+      </w:pPr>
+      <w:r>
+        <w:rPr>
+          <w:rFonts w:ascii="Segoe UI Emoji" w:hAnsi="Segoe UI Emoji" w:cs="Segoe UI Emoji"/>
+          <w:sz w:val="24"/>
+          <w:szCs w:val="24"/>
+        </w:rPr>
+        <w:t>Troll</w:t>
+      </w:r>
+    </w:p>
+    <w:p>
+      <w:pPr>
+        <w:rPr>
+          <w:rFonts w:ascii="Segoe UI Emoji" w:hAnsi="Segoe UI Emoji" w:cs="Segoe UI Emoji"/>
+          <w:sz w:val="24"/>
+          <w:szCs w:val="24"/>
+        </w:rPr>
+      </w:pPr>
+      <w:r>
+        <w:rPr>
+          <w:rFonts w:ascii="Segoe UI Emoji" w:hAnsi="Segoe UI Emoji" w:cs="Segoe UI Emoji"/>
+          <w:sz w:val="24"/>
+          <w:szCs w:val="24"/>
+        </w:rPr>
+        <w:t>Voleur</w:t>
+      </w:r>
+    </w:p>
+    <w:p>
+      <w:pPr>
+        <w:rPr>
+          <w:rFonts w:ascii="Segoe UI Emoji" w:hAnsi="Segoe UI Emoji" w:cs="Segoe UI Emoji"/>
+          <w:sz w:val="24"/>
+          <w:szCs w:val="24"/>
+        </w:rPr>
+      </w:pPr>
+    </w:p>
+    <w:p>
+      <w:pPr>
+        <w:rPr>
+          <w:rFonts w:ascii="Segoe UI Emoji" w:hAnsi="Segoe UI Emoji" w:cs="Segoe UI Emoji"/>
+          <w:sz w:val="24"/>
+          <w:szCs w:val="24"/>
+        </w:rPr>
+      </w:pPr>
+      <w:r>
+        <w:rPr>
+          <w:rFonts w:ascii="Segoe UI Emoji" w:hAnsi="Segoe UI Emoji" w:cs="Segoe UI Emoji"/>
+          <w:sz w:val="24"/>
+          <w:szCs w:val="24"/>
+        </w:rPr>
+        <w:t>Déroulement Item :</w:t>
+      </w:r>
+    </w:p>
+    <w:p>
+      <w:pPr>
+        <w:rPr>
+          <w:rFonts w:ascii="Segoe UI Emoji" w:hAnsi="Segoe UI Emoji" w:cs="Segoe UI Emoji"/>
+          <w:sz w:val="24"/>
+          <w:szCs w:val="24"/>
+        </w:rPr>
+      </w:pPr>
+      <w:r>
+        <w:rPr>
+          <w:rFonts w:ascii="Segoe UI Emoji" w:hAnsi="Segoe UI Emoji" w:cs="Segoe UI Emoji"/>
+          <w:sz w:val="24"/>
+          <w:szCs w:val="24"/>
+        </w:rPr>
+        <w:t>Vie + Force</w:t>
+      </w:r>
+    </w:p>
+    <w:p>
+      <w:pPr>
+        <w:rPr>
+          <w:rFonts w:ascii="Segoe UI Emoji" w:hAnsi="Segoe UI Emoji" w:cs="Segoe UI Emoji"/>
+          <w:sz w:val="24"/>
+          <w:szCs w:val="24"/>
+        </w:rPr>
+      </w:pPr>
+      <w:r>
+        <w:rPr>
+          <w:rFonts w:ascii="Segoe UI Emoji" w:hAnsi="Segoe UI Emoji" w:cs="Segoe UI Emoji"/>
+          <w:sz w:val="24"/>
+          <w:szCs w:val="24"/>
+        </w:rPr>
+        <w:t>Rien</w:t>
+      </w:r>
+    </w:p>
+    <w:p>
+      <w:pPr>
+        <w:rPr>
+          <w:rFonts w:ascii="Segoe UI Emoji" w:hAnsi="Segoe UI Emoji" w:cs="Segoe UI Emoji"/>
+          <w:sz w:val="24"/>
+          <w:szCs w:val="24"/>
+        </w:rPr>
+      </w:pPr>
+      <w:r>
+        <w:rPr>
+          <w:rFonts w:ascii="Segoe UI Emoji" w:hAnsi="Segoe UI Emoji" w:cs="Segoe UI Emoji"/>
+          <w:sz w:val="24"/>
+          <w:szCs w:val="24"/>
+        </w:rPr>
+        <w:lastRenderedPageBreak/>
+        <w:t>Rien</w:t>
+      </w:r>
+    </w:p>
+    <w:p>
+      <w:pPr>
+        <w:rPr>
+          <w:rFonts w:ascii="Segoe UI Emoji" w:hAnsi="Segoe UI Emoji" w:cs="Segoe UI Emoji"/>
+          <w:sz w:val="24"/>
+          <w:szCs w:val="24"/>
+        </w:rPr>
+      </w:pPr>
+      <w:r>
+        <w:rPr>
+          <w:rFonts w:ascii="Segoe UI Emoji" w:hAnsi="Segoe UI Emoji" w:cs="Segoe UI Emoji"/>
+          <w:sz w:val="24"/>
+          <w:szCs w:val="24"/>
+        </w:rPr>
+        <w:t>Rien</w:t>
+      </w:r>
+    </w:p>
+    <w:p>
+      <w:pPr>
+        <w:rPr>
+          <w:sz w:val="24"/>
+          <w:szCs w:val="24"/>
+        </w:rPr>
+      </w:pPr>
+      <w:r>
+        <w:rPr>
+          <w:rFonts w:ascii="Segoe UI Emoji" w:hAnsi="Segoe UI Emoji" w:cs="Segoe UI Emoji"/>
+          <w:sz w:val="24"/>
+          <w:szCs w:val="24"/>
+        </w:rPr>
+        <w:t>Force</w:t>
       </w:r>
     </w:p>
     <w:sectPr>

</xml_diff>